<commit_message>
Spring 2026 lab document update
</commit_message>
<xml_diff>
--- a/Lab05.docx
+++ b/Lab05.docx
@@ -2338,21 +2338,7 @@
                   <w:rStyle w:val="Hyperlink"/>
                   <w:rFonts w:ascii="Times New Roman" w:hAnsi="Times New Roman" w:cs="Times New Roman"/>
                 </w:rPr>
-                <w:t>EK-TM4C</w:t>
-              </w:r>
-              <w:r>
-                <w:rPr>
-                  <w:rStyle w:val="Hyperlink"/>
-                  <w:rFonts w:ascii="Times New Roman" w:hAnsi="Times New Roman" w:cs="Times New Roman"/>
-                </w:rPr>
-                <w:t>1</w:t>
-              </w:r>
-              <w:r>
-                <w:rPr>
-                  <w:rStyle w:val="Hyperlink"/>
-                  <w:rFonts w:ascii="Times New Roman" w:hAnsi="Times New Roman" w:cs="Times New Roman"/>
-                </w:rPr>
-                <w:t>23GXL datasheet</w:t>
+                <w:t>EK-TM4C123GXL datasheet</w:t>
               </w:r>
             </w:hyperlink>
           </w:p>
@@ -2708,21 +2694,7 @@
                   <w:rStyle w:val="Hyperlink"/>
                   <w:rFonts w:ascii="Times New Roman" w:hAnsi="Times New Roman" w:cs="Times New Roman"/>
                 </w:rPr>
-                <w:t>TLV561</w:t>
-              </w:r>
-              <w:r>
-                <w:rPr>
-                  <w:rStyle w:val="Hyperlink"/>
-                  <w:rFonts w:ascii="Times New Roman" w:hAnsi="Times New Roman" w:cs="Times New Roman"/>
-                </w:rPr>
-                <w:t>6</w:t>
-              </w:r>
-              <w:r>
-                <w:rPr>
-                  <w:rStyle w:val="Hyperlink"/>
-                  <w:rFonts w:ascii="Times New Roman" w:hAnsi="Times New Roman" w:cs="Times New Roman"/>
-                </w:rPr>
-                <w:t xml:space="preserve"> datasheet</w:t>
+                <w:t>TLV5616 datasheet</w:t>
               </w:r>
             </w:hyperlink>
             <w:r>
@@ -2734,21 +2706,7 @@
                   <w:rStyle w:val="Hyperlink"/>
                   <w:rFonts w:ascii="Times New Roman" w:hAnsi="Times New Roman" w:cs="Times New Roman"/>
                 </w:rPr>
-                <w:t>TLV561</w:t>
-              </w:r>
-              <w:r>
-                <w:rPr>
-                  <w:rStyle w:val="Hyperlink"/>
-                  <w:rFonts w:ascii="Times New Roman" w:hAnsi="Times New Roman" w:cs="Times New Roman"/>
-                </w:rPr>
-                <w:t>8</w:t>
-              </w:r>
-              <w:r>
-                <w:rPr>
-                  <w:rStyle w:val="Hyperlink"/>
-                  <w:rFonts w:ascii="Times New Roman" w:hAnsi="Times New Roman" w:cs="Times New Roman"/>
-                </w:rPr>
-                <w:t xml:space="preserve"> datasheet</w:t>
+                <w:t>TLV5618 datasheet</w:t>
               </w:r>
             </w:hyperlink>
           </w:p>
@@ -2861,21 +2819,7 @@
                   <w:rStyle w:val="Hyperlink"/>
                   <w:rFonts w:ascii="Times New Roman" w:hAnsi="Times New Roman" w:cs="Times New Roman"/>
                 </w:rPr>
-                <w:t>LM489</w:t>
-              </w:r>
-              <w:r>
-                <w:rPr>
-                  <w:rStyle w:val="Hyperlink"/>
-                  <w:rFonts w:ascii="Times New Roman" w:hAnsi="Times New Roman" w:cs="Times New Roman"/>
-                </w:rPr>
-                <w:t>0</w:t>
-              </w:r>
-              <w:r>
-                <w:rPr>
-                  <w:rStyle w:val="Hyperlink"/>
-                  <w:rFonts w:ascii="Times New Roman" w:hAnsi="Times New Roman" w:cs="Times New Roman"/>
-                </w:rPr>
-                <w:t>M</w:t>
+                <w:t>LM4890M</w:t>
               </w:r>
             </w:hyperlink>
             <w:r>
@@ -2897,21 +2841,7 @@
                   <w:rStyle w:val="Hyperlink"/>
                   <w:rFonts w:ascii="Times New Roman" w:hAnsi="Times New Roman" w:cs="Times New Roman"/>
                 </w:rPr>
-                <w:t>LM4890</w:t>
-              </w:r>
-              <w:r>
-                <w:rPr>
-                  <w:rStyle w:val="Hyperlink"/>
-                  <w:rFonts w:ascii="Times New Roman" w:hAnsi="Times New Roman" w:cs="Times New Roman"/>
-                </w:rPr>
-                <w:t>M</w:t>
-              </w:r>
-              <w:r>
-                <w:rPr>
-                  <w:rStyle w:val="Hyperlink"/>
-                  <w:rFonts w:ascii="Times New Roman" w:hAnsi="Times New Roman" w:cs="Times New Roman"/>
-                </w:rPr>
-                <w:t xml:space="preserve"> data sheet</w:t>
+                <w:t>LM4890M data sheet</w:t>
               </w:r>
             </w:hyperlink>
           </w:p>
@@ -3063,21 +2993,7 @@
                   <w:rStyle w:val="Hyperlink"/>
                   <w:rFonts w:ascii="Times New Roman" w:hAnsi="Times New Roman" w:cs="Times New Roman"/>
                 </w:rPr>
-                <w:t>LM4041C d</w:t>
-              </w:r>
-              <w:r>
-                <w:rPr>
-                  <w:rStyle w:val="Hyperlink"/>
-                  <w:rFonts w:ascii="Times New Roman" w:hAnsi="Times New Roman" w:cs="Times New Roman"/>
-                </w:rPr>
-                <w:t>a</w:t>
-              </w:r>
-              <w:r>
-                <w:rPr>
-                  <w:rStyle w:val="Hyperlink"/>
-                  <w:rFonts w:ascii="Times New Roman" w:hAnsi="Times New Roman" w:cs="Times New Roman"/>
-                </w:rPr>
-                <w:t>tasheet</w:t>
+                <w:t>LM4041C datasheet</w:t>
               </w:r>
             </w:hyperlink>
           </w:p>
@@ -3164,13 +3080,11 @@
             <w:pPr>
               <w:rPr>
                 <w:rFonts w:ascii="Times New Roman" w:hAnsi="Times New Roman" w:cs="Times New Roman"/>
-                <w:strike/>
               </w:rPr>
             </w:pPr>
             <w:r>
               <w:rPr>
                 <w:rFonts w:ascii="Times New Roman" w:hAnsi="Times New Roman" w:cs="Times New Roman"/>
-                <w:strike/>
               </w:rPr>
               <w:t>TPA731D audio amp</w:t>
             </w:r>
@@ -3184,7 +3098,6 @@
             <w:pPr>
               <w:rPr>
                 <w:rFonts w:ascii="Times New Roman" w:hAnsi="Times New Roman" w:cs="Times New Roman"/>
-                <w:strike/>
               </w:rPr>
             </w:pPr>
             <w:hyperlink r:id="rId19">
@@ -3192,7 +3105,6 @@
                 <w:rPr>
                   <w:rStyle w:val="Hyperlink"/>
                   <w:rFonts w:ascii="Times New Roman" w:hAnsi="Times New Roman" w:cs="Times New Roman"/>
-                  <w:strike/>
                 </w:rPr>
                 <w:t>TPA731 datasheet</w:t>
               </w:r>
@@ -3207,20 +3119,17 @@
             <w:pPr>
               <w:rPr>
                 <w:rFonts w:ascii="Times New Roman" w:hAnsi="Times New Roman" w:cs="Times New Roman"/>
-                <w:strike/>
               </w:rPr>
             </w:pPr>
             <w:r>
               <w:rPr>
                 <w:rFonts w:ascii="Times New Roman" w:hAnsi="Times New Roman" w:cs="Times New Roman"/>
-                <w:strike/>
               </w:rPr>
               <w:t>$</w:t>
             </w:r>
             <w:r>
               <w:rPr>
                 <w:rFonts w:ascii="Times New Roman" w:hAnsi="Times New Roman" w:cs="Times New Roman"/>
-                <w:strike/>
               </w:rPr>
               <w:t>2.54</w:t>
             </w:r>
@@ -3234,7 +3143,6 @@
             <w:pPr>
               <w:rPr>
                 <w:rFonts w:ascii="Times New Roman" w:hAnsi="Times New Roman" w:cs="Times New Roman"/>
-                <w:strike/>
               </w:rPr>
             </w:pPr>
             <w:r>
@@ -3242,14 +3150,12 @@
                 <w:rFonts w:ascii="Times New Roman" w:hAnsi="Times New Roman" w:cs="Times New Roman"/>
                 <w:b/>
                 <w:bCs/>
-                <w:strike/>
               </w:rPr>
               <w:t>Mouser</w:t>
             </w:r>
             <w:r>
               <w:rPr>
                 <w:rFonts w:ascii="Times New Roman" w:hAnsi="Times New Roman" w:cs="Times New Roman"/>
-                <w:strike/>
               </w:rPr>
               <w:t>, Digikey</w:t>
             </w:r>
@@ -3268,27 +3174,23 @@
             <w:pPr>
               <w:rPr>
                 <w:rFonts w:ascii="Times New Roman" w:hAnsi="Times New Roman" w:cs="Times New Roman"/>
-                <w:strike/>
               </w:rPr>
             </w:pPr>
             <w:r>
               <w:rPr>
                 <w:rFonts w:ascii="Times New Roman" w:hAnsi="Times New Roman" w:cs="Times New Roman"/>
-                <w:strike/>
               </w:rPr>
               <w:t>MC34119</w:t>
             </w:r>
             <w:r>
               <w:rPr>
                 <w:rFonts w:ascii="Times New Roman" w:hAnsi="Times New Roman" w:cs="Times New Roman"/>
-                <w:strike/>
               </w:rPr>
               <w:t>P</w:t>
             </w:r>
             <w:r>
               <w:rPr>
                 <w:rFonts w:ascii="Times New Roman" w:hAnsi="Times New Roman" w:cs="Times New Roman"/>
-                <w:strike/>
               </w:rPr>
               <w:t xml:space="preserve"> (discontinued)</w:t>
             </w:r>
@@ -3302,7 +3204,6 @@
             <w:pPr>
               <w:rPr>
                 <w:rFonts w:ascii="Times New Roman" w:hAnsi="Times New Roman" w:cs="Times New Roman"/>
-                <w:strike/>
               </w:rPr>
             </w:pPr>
             <w:hyperlink r:id="rId20">
@@ -3310,7 +3211,6 @@
                 <w:rPr>
                   <w:rStyle w:val="Hyperlink"/>
                   <w:rFonts w:ascii="Times New Roman" w:hAnsi="Times New Roman" w:cs="Times New Roman"/>
-                  <w:strike/>
                 </w:rPr>
                 <w:t>MC34119 datasheet</w:t>
               </w:r>
@@ -3325,13 +3225,11 @@
             <w:pPr>
               <w:rPr>
                 <w:rFonts w:ascii="Times New Roman" w:hAnsi="Times New Roman" w:cs="Times New Roman"/>
-                <w:strike/>
               </w:rPr>
             </w:pPr>
             <w:r>
               <w:rPr>
                 <w:rFonts w:ascii="Times New Roman" w:hAnsi="Times New Roman" w:cs="Times New Roman"/>
-                <w:strike/>
               </w:rPr>
               <w:t>N/A</w:t>
             </w:r>
@@ -3345,13 +3243,11 @@
             <w:pPr>
               <w:rPr>
                 <w:rFonts w:ascii="Times New Roman" w:hAnsi="Times New Roman" w:cs="Times New Roman"/>
-                <w:strike/>
               </w:rPr>
             </w:pPr>
             <w:r>
               <w:rPr>
                 <w:rFonts w:ascii="Times New Roman" w:hAnsi="Times New Roman" w:cs="Times New Roman"/>
-                <w:strike/>
               </w:rPr>
               <w:t>EER Checkout Desk</w:t>
             </w:r>
@@ -3387,14 +3283,12 @@
       <w:r>
         <w:rPr>
           <w:rFonts w:ascii="Times New Roman" w:hAnsi="Times New Roman" w:cs="Times New Roman"/>
-          <w:strike/>
         </w:rPr>
         <w:t>can use TPA731D or MC34119P</w:t>
       </w:r>
       <w:r>
         <w:rPr>
           <w:rFonts w:ascii="Times New Roman" w:hAnsi="Times New Roman" w:cs="Times New Roman"/>
-          <w:strike/>
         </w:rPr>
         <w:t xml:space="preserve"> (not both)</w:t>
       </w:r>
@@ -6968,23 +6862,7 @@
           <w:rFonts w:ascii="Times New Roman" w:eastAsia="Calibri" w:hAnsi="Times New Roman" w:cs="Times New Roman"/>
           <w:color w:val="000000" w:themeColor="text1"/>
         </w:rPr>
-        <w:t xml:space="preserve">. Using a dual channel scope </w:t>
-      </w:r>
-      <w:proofErr w:type="gramStart"/>
-      <w:r>
-        <w:rPr>
-          <w:rFonts w:ascii="Times New Roman" w:eastAsia="Calibri" w:hAnsi="Times New Roman" w:cs="Times New Roman"/>
-          <w:color w:val="000000" w:themeColor="text1"/>
-        </w:rPr>
-        <w:t>measure</w:t>
-      </w:r>
-      <w:proofErr w:type="gramEnd"/>
-      <w:r>
-        <w:rPr>
-          <w:rFonts w:ascii="Times New Roman" w:eastAsia="Calibri" w:hAnsi="Times New Roman" w:cs="Times New Roman"/>
-          <w:color w:val="000000" w:themeColor="text1"/>
-        </w:rPr>
-        <w:t xml:space="preserve"> the outputs on pins 5 and 8 (like Figure </w:t>
+        <w:t xml:space="preserve">. Using a dual channel scope measure the outputs on pins 5 and 8 (like Figure </w:t>
       </w:r>
       <w:r>
         <w:rPr>
@@ -8400,21 +8278,21 @@
         <w:rPr>
           <w:rFonts w:ascii="Times New Roman" w:hAnsi="Times New Roman" w:cs="Times New Roman"/>
         </w:rPr>
-        <w:t xml:space="preserve"> at the same time. This way, you can play music containing melody and harmony. For this bonus you will use two sine-wave generators and add them together in hardware or software; be careful not to overflow and cause clipping. You will need three </w:t>
+        <w:t xml:space="preserve"> at the same time. This way, you can play music containing melody and harmony. For this bonus you will use two sine-wave generators and add them together in hardware or software; be careful not to overflow and cause clipping. You will need three interrupts: one for outputting the </w:t>
       </w:r>
       <w:proofErr w:type="gramStart"/>
       <w:r>
         <w:rPr>
           <w:rFonts w:ascii="Times New Roman" w:hAnsi="Times New Roman" w:cs="Times New Roman"/>
         </w:rPr>
-        <w:t>interrupts</w:t>
+        <w:t>sine-wave</w:t>
       </w:r>
       <w:proofErr w:type="gramEnd"/>
       <w:r>
         <w:rPr>
           <w:rFonts w:ascii="Times New Roman" w:hAnsi="Times New Roman" w:cs="Times New Roman"/>
         </w:rPr>
-        <w:t xml:space="preserve">: one for outputting the </w:t>
+        <w:t xml:space="preserve"> for the melody, one for outputting the </w:t>
       </w:r>
       <w:proofErr w:type="gramStart"/>
       <w:r>
@@ -8428,35 +8306,7 @@
         <w:rPr>
           <w:rFonts w:ascii="Times New Roman" w:hAnsi="Times New Roman" w:cs="Times New Roman"/>
         </w:rPr>
-        <w:t xml:space="preserve"> for the melody, one for outputting the </w:t>
-      </w:r>
-      <w:proofErr w:type="gramStart"/>
-      <w:r>
-        <w:rPr>
-          <w:rFonts w:ascii="Times New Roman" w:hAnsi="Times New Roman" w:cs="Times New Roman"/>
-        </w:rPr>
-        <w:t>sine-wave</w:t>
-      </w:r>
-      <w:proofErr w:type="gramEnd"/>
-      <w:r>
-        <w:rPr>
-          <w:rFonts w:ascii="Times New Roman" w:hAnsi="Times New Roman" w:cs="Times New Roman"/>
-        </w:rPr>
-        <w:t xml:space="preserve"> for </w:t>
-      </w:r>
-      <w:proofErr w:type="gramStart"/>
-      <w:r>
-        <w:rPr>
-          <w:rFonts w:ascii="Times New Roman" w:hAnsi="Times New Roman" w:cs="Times New Roman"/>
-        </w:rPr>
-        <w:t>the harmony</w:t>
-      </w:r>
-      <w:proofErr w:type="gramEnd"/>
-      <w:r>
-        <w:rPr>
-          <w:rFonts w:ascii="Times New Roman" w:hAnsi="Times New Roman" w:cs="Times New Roman"/>
-        </w:rPr>
-        <w:t xml:space="preserve">, and a third to interpret the music (updating the frequencies and envelopes for the other two.) You will have to add the two </w:t>
+        <w:t xml:space="preserve"> for the harmony, and a third to interpret the music (updating the frequencies and envelopes for the other two.) You will have to add the two </w:t>
       </w:r>
       <w:proofErr w:type="gramStart"/>
       <w:r>
@@ -8806,8 +8656,12 @@
       </w:pPr>
     </w:p>
     <w:sectPr>
-      <w:headerReference w:type="default" r:id="rId31"/>
-      <w:footerReference w:type="default" r:id="rId32"/>
+      <w:headerReference w:type="even" r:id="rId31"/>
+      <w:headerReference w:type="default" r:id="rId32"/>
+      <w:footerReference w:type="even" r:id="rId33"/>
+      <w:footerReference w:type="default" r:id="rId34"/>
+      <w:headerReference w:type="first" r:id="rId35"/>
+      <w:footerReference w:type="first" r:id="rId36"/>
       <w:pgSz w:w="12240" w:h="15840"/>
       <w:pgMar w:top="1440" w:right="1440" w:bottom="1440" w:left="1440" w:header="720" w:footer="720" w:gutter="0"/>
       <w:cols w:space="720"/>
@@ -8843,6 +8697,16 @@
 </file>
 
 <file path=word/footer1.xml><?xml version="1.0" encoding="utf-8"?>
+<w:ftr xmlns:wpc="http://schemas.microsoft.com/office/word/2010/wordprocessingCanvas" xmlns:cx="http://schemas.microsoft.com/office/drawing/2014/chartex" xmlns:cx1="http://schemas.microsoft.com/office/drawing/2015/9/8/chartex" xmlns:cx2="http://schemas.microsoft.com/office/drawing/2015/10/21/chartex" xmlns:cx3="http://schemas.microsoft.com/office/drawing/2016/5/9/chartex" xmlns:cx4="http://schemas.microsoft.com/office/drawing/2016/5/10/chartex" xmlns:cx5="http://schemas.microsoft.com/office/drawing/2016/5/11/chartex" xmlns:cx6="http://schemas.microsoft.com/office/drawing/2016/5/12/chartex" xmlns:cx7="http://schemas.microsoft.com/office/drawing/2016/5/13/chartex" xmlns:cx8="http://schemas.microsoft.com/office/drawing/2016/5/14/chartex" xmlns:mc="http://schemas.openxmlformats.org/markup-compatibility/2006" xmlns:aink="http://schemas.microsoft.com/office/drawing/2016/ink" xmlns:am3d="http://schemas.microsoft.com/office/drawing/2017/model3d" xmlns:o="urn:schemas-microsoft-com:office:office" xmlns:oel="http://schemas.microsoft.com/office/2019/extlst" xmlns:r="http://schemas.openxmlformats.org/officeDocument/2006/relationships" xmlns:m="http://schemas.openxmlformats.org/officeDocument/2006/math" xmlns:v="urn:schemas-microsoft-com:vml" xmlns:wp14="http://schemas.microsoft.com/office/word/2010/wordprocessingDrawing" xmlns:wp="http://schemas.openxmlformats.org/drawingml/2006/wordprocessingDrawing" xmlns:w10="urn:schemas-microsoft-com:office:word" xmlns:w="http://schemas.openxmlformats.org/wordprocessingml/2006/main" xmlns:w14="http://schemas.microsoft.com/office/word/2010/wordml" xmlns:w15="http://schemas.microsoft.com/office/word/2012/wordml" xmlns:w16cex="http://schemas.microsoft.com/office/word/2018/wordml/cex" xmlns:w16cid="http://schemas.microsoft.com/office/word/2016/wordml/cid" xmlns:w16="http://schemas.microsoft.com/office/word/2018/wordml" xmlns:w16du="http://schemas.microsoft.com/office/word/2023/wordml/word16du" xmlns:w16sdtdh="http://schemas.microsoft.com/office/word/2020/wordml/sdtdatahash" xmlns:w16sdtfl="http://schemas.microsoft.com/office/word/2024/wordml/sdtformatlock" xmlns:w16se="http://schemas.microsoft.com/office/word/2015/wordml/symex" xmlns:wpg="http://schemas.microsoft.com/office/word/2010/wordprocessingGroup" xmlns:wpi="http://schemas.microsoft.com/office/word/2010/wordprocessingInk" xmlns:wne="http://schemas.microsoft.com/office/word/2006/wordml" xmlns:wps="http://schemas.microsoft.com/office/word/2010/wordprocessingShape" mc:Ignorable="w14 w15 w16se w16cid w16 w16cex w16sdtdh w16sdtfl w16du wp14">
+  <w:p>
+    <w:pPr>
+      <w:pStyle w:val="Footer"/>
+    </w:pPr>
+  </w:p>
+</w:ftr>
+</file>
+
+<file path=word/footer2.xml><?xml version="1.0" encoding="utf-8"?>
 <w:ftr xmlns:wpc="http://schemas.microsoft.com/office/word/2010/wordprocessingCanvas" xmlns:cx="http://schemas.microsoft.com/office/drawing/2014/chartex" xmlns:cx1="http://schemas.microsoft.com/office/drawing/2015/9/8/chartex" xmlns:cx2="http://schemas.microsoft.com/office/drawing/2015/10/21/chartex" xmlns:cx3="http://schemas.microsoft.com/office/drawing/2016/5/9/chartex" xmlns:cx4="http://schemas.microsoft.com/office/drawing/2016/5/10/chartex" xmlns:cx5="http://schemas.microsoft.com/office/drawing/2016/5/11/chartex" xmlns:cx6="http://schemas.microsoft.com/office/drawing/2016/5/12/chartex" xmlns:cx7="http://schemas.microsoft.com/office/drawing/2016/5/13/chartex" xmlns:cx8="http://schemas.microsoft.com/office/drawing/2016/5/14/chartex" xmlns:mc="http://schemas.openxmlformats.org/markup-compatibility/2006" xmlns:aink="http://schemas.microsoft.com/office/drawing/2016/ink" xmlns:am3d="http://schemas.microsoft.com/office/drawing/2017/model3d" xmlns:o="urn:schemas-microsoft-com:office:office" xmlns:oel="http://schemas.microsoft.com/office/2019/extlst" xmlns:r="http://schemas.openxmlformats.org/officeDocument/2006/relationships" xmlns:m="http://schemas.openxmlformats.org/officeDocument/2006/math" xmlns:v="urn:schemas-microsoft-com:vml" xmlns:wp14="http://schemas.microsoft.com/office/word/2010/wordprocessingDrawing" xmlns:wp="http://schemas.openxmlformats.org/drawingml/2006/wordprocessingDrawing" xmlns:w10="urn:schemas-microsoft-com:office:word" xmlns:w="http://schemas.openxmlformats.org/wordprocessingml/2006/main" xmlns:w14="http://schemas.microsoft.com/office/word/2010/wordml" xmlns:w15="http://schemas.microsoft.com/office/word/2012/wordml" xmlns:w16cex="http://schemas.microsoft.com/office/word/2018/wordml/cex" xmlns:w16cid="http://schemas.microsoft.com/office/word/2016/wordml/cid" xmlns:w16="http://schemas.microsoft.com/office/word/2018/wordml" xmlns:w16du="http://schemas.microsoft.com/office/word/2023/wordml/word16du" xmlns:w16sdtdh="http://schemas.microsoft.com/office/word/2020/wordml/sdtdatahash" xmlns:w16sdtfl="http://schemas.microsoft.com/office/word/2024/wordml/sdtformatlock" xmlns:w16se="http://schemas.microsoft.com/office/word/2015/wordml/symex" xmlns:wpg="http://schemas.microsoft.com/office/word/2010/wordprocessingGroup" xmlns:wpi="http://schemas.microsoft.com/office/word/2010/wordprocessingInk" xmlns:wne="http://schemas.microsoft.com/office/word/2006/wordml" xmlns:wps="http://schemas.microsoft.com/office/word/2010/wordprocessingShape" mc:Ignorable="w14 w15 w16se w16cid w16 w16cex w16sdtdh w16sdtfl w16du wp14">
   <w:tbl>
     <w:tblPr>
@@ -8921,6 +8785,16 @@
 </w:ftr>
 </file>
 
+<file path=word/footer3.xml><?xml version="1.0" encoding="utf-8"?>
+<w:ftr xmlns:wpc="http://schemas.microsoft.com/office/word/2010/wordprocessingCanvas" xmlns:cx="http://schemas.microsoft.com/office/drawing/2014/chartex" xmlns:cx1="http://schemas.microsoft.com/office/drawing/2015/9/8/chartex" xmlns:cx2="http://schemas.microsoft.com/office/drawing/2015/10/21/chartex" xmlns:cx3="http://schemas.microsoft.com/office/drawing/2016/5/9/chartex" xmlns:cx4="http://schemas.microsoft.com/office/drawing/2016/5/10/chartex" xmlns:cx5="http://schemas.microsoft.com/office/drawing/2016/5/11/chartex" xmlns:cx6="http://schemas.microsoft.com/office/drawing/2016/5/12/chartex" xmlns:cx7="http://schemas.microsoft.com/office/drawing/2016/5/13/chartex" xmlns:cx8="http://schemas.microsoft.com/office/drawing/2016/5/14/chartex" xmlns:mc="http://schemas.openxmlformats.org/markup-compatibility/2006" xmlns:aink="http://schemas.microsoft.com/office/drawing/2016/ink" xmlns:am3d="http://schemas.microsoft.com/office/drawing/2017/model3d" xmlns:o="urn:schemas-microsoft-com:office:office" xmlns:oel="http://schemas.microsoft.com/office/2019/extlst" xmlns:r="http://schemas.openxmlformats.org/officeDocument/2006/relationships" xmlns:m="http://schemas.openxmlformats.org/officeDocument/2006/math" xmlns:v="urn:schemas-microsoft-com:vml" xmlns:wp14="http://schemas.microsoft.com/office/word/2010/wordprocessingDrawing" xmlns:wp="http://schemas.openxmlformats.org/drawingml/2006/wordprocessingDrawing" xmlns:w10="urn:schemas-microsoft-com:office:word" xmlns:w="http://schemas.openxmlformats.org/wordprocessingml/2006/main" xmlns:w14="http://schemas.microsoft.com/office/word/2010/wordml" xmlns:w15="http://schemas.microsoft.com/office/word/2012/wordml" xmlns:w16cex="http://schemas.microsoft.com/office/word/2018/wordml/cex" xmlns:w16cid="http://schemas.microsoft.com/office/word/2016/wordml/cid" xmlns:w16="http://schemas.microsoft.com/office/word/2018/wordml" xmlns:w16du="http://schemas.microsoft.com/office/word/2023/wordml/word16du" xmlns:w16sdtdh="http://schemas.microsoft.com/office/word/2020/wordml/sdtdatahash" xmlns:w16sdtfl="http://schemas.microsoft.com/office/word/2024/wordml/sdtformatlock" xmlns:w16se="http://schemas.microsoft.com/office/word/2015/wordml/symex" xmlns:wpg="http://schemas.microsoft.com/office/word/2010/wordprocessingGroup" xmlns:wpi="http://schemas.microsoft.com/office/word/2010/wordprocessingInk" xmlns:wne="http://schemas.microsoft.com/office/word/2006/wordml" xmlns:wps="http://schemas.microsoft.com/office/word/2010/wordprocessingShape" mc:Ignorable="w14 w15 w16se w16cid w16 w16cex w16sdtdh w16sdtfl w16du wp14">
+  <w:p>
+    <w:pPr>
+      <w:pStyle w:val="Footer"/>
+    </w:pPr>
+  </w:p>
+</w:ftr>
+</file>
+
 <file path=word/footnotes.xml><?xml version="1.0" encoding="utf-8"?>
 <w:footnotes xmlns:wpc="http://schemas.microsoft.com/office/word/2010/wordprocessingCanvas" xmlns:cx="http://schemas.microsoft.com/office/drawing/2014/chartex" xmlns:cx1="http://schemas.microsoft.com/office/drawing/2015/9/8/chartex" xmlns:cx2="http://schemas.microsoft.com/office/drawing/2015/10/21/chartex" xmlns:cx3="http://schemas.microsoft.com/office/drawing/2016/5/9/chartex" xmlns:cx4="http://schemas.microsoft.com/office/drawing/2016/5/10/chartex" xmlns:cx5="http://schemas.microsoft.com/office/drawing/2016/5/11/chartex" xmlns:cx6="http://schemas.microsoft.com/office/drawing/2016/5/12/chartex" xmlns:cx7="http://schemas.microsoft.com/office/drawing/2016/5/13/chartex" xmlns:cx8="http://schemas.microsoft.com/office/drawing/2016/5/14/chartex" xmlns:mc="http://schemas.openxmlformats.org/markup-compatibility/2006" xmlns:aink="http://schemas.microsoft.com/office/drawing/2016/ink" xmlns:am3d="http://schemas.microsoft.com/office/drawing/2017/model3d" xmlns:o="urn:schemas-microsoft-com:office:office" xmlns:oel="http://schemas.microsoft.com/office/2019/extlst" xmlns:r="http://schemas.openxmlformats.org/officeDocument/2006/relationships" xmlns:m="http://schemas.openxmlformats.org/officeDocument/2006/math" xmlns:v="urn:schemas-microsoft-com:vml" xmlns:wp14="http://schemas.microsoft.com/office/word/2010/wordprocessingDrawing" xmlns:wp="http://schemas.openxmlformats.org/drawingml/2006/wordprocessingDrawing" xmlns:w10="urn:schemas-microsoft-com:office:word" xmlns:w="http://schemas.openxmlformats.org/wordprocessingml/2006/main" xmlns:w14="http://schemas.microsoft.com/office/word/2010/wordml" xmlns:w15="http://schemas.microsoft.com/office/word/2012/wordml" xmlns:w16cex="http://schemas.microsoft.com/office/word/2018/wordml/cex" xmlns:w16cid="http://schemas.microsoft.com/office/word/2016/wordml/cid" xmlns:w16="http://schemas.microsoft.com/office/word/2018/wordml" xmlns:w16du="http://schemas.microsoft.com/office/word/2023/wordml/word16du" xmlns:w16sdtdh="http://schemas.microsoft.com/office/word/2020/wordml/sdtdatahash" xmlns:w16sdtfl="http://schemas.microsoft.com/office/word/2024/wordml/sdtformatlock" xmlns:w16se="http://schemas.microsoft.com/office/word/2015/wordml/symex" xmlns:wpg="http://schemas.microsoft.com/office/word/2010/wordprocessingGroup" xmlns:wpi="http://schemas.microsoft.com/office/word/2010/wordprocessingInk" xmlns:wne="http://schemas.microsoft.com/office/word/2006/wordml" xmlns:wps="http://schemas.microsoft.com/office/word/2010/wordprocessingShape" mc:Ignorable="w14 w15 w16se w16cid w16 w16cex w16sdtdh w16sdtfl w16du wp14">
   <w:footnote w:type="separator" w:id="-1">
@@ -8947,6 +8821,16 @@
 </file>
 
 <file path=word/header1.xml><?xml version="1.0" encoding="utf-8"?>
+<w:hdr xmlns:wpc="http://schemas.microsoft.com/office/word/2010/wordprocessingCanvas" xmlns:cx="http://schemas.microsoft.com/office/drawing/2014/chartex" xmlns:cx1="http://schemas.microsoft.com/office/drawing/2015/9/8/chartex" xmlns:cx2="http://schemas.microsoft.com/office/drawing/2015/10/21/chartex" xmlns:cx3="http://schemas.microsoft.com/office/drawing/2016/5/9/chartex" xmlns:cx4="http://schemas.microsoft.com/office/drawing/2016/5/10/chartex" xmlns:cx5="http://schemas.microsoft.com/office/drawing/2016/5/11/chartex" xmlns:cx6="http://schemas.microsoft.com/office/drawing/2016/5/12/chartex" xmlns:cx7="http://schemas.microsoft.com/office/drawing/2016/5/13/chartex" xmlns:cx8="http://schemas.microsoft.com/office/drawing/2016/5/14/chartex" xmlns:mc="http://schemas.openxmlformats.org/markup-compatibility/2006" xmlns:aink="http://schemas.microsoft.com/office/drawing/2016/ink" xmlns:am3d="http://schemas.microsoft.com/office/drawing/2017/model3d" xmlns:o="urn:schemas-microsoft-com:office:office" xmlns:oel="http://schemas.microsoft.com/office/2019/extlst" xmlns:r="http://schemas.openxmlformats.org/officeDocument/2006/relationships" xmlns:m="http://schemas.openxmlformats.org/officeDocument/2006/math" xmlns:v="urn:schemas-microsoft-com:vml" xmlns:wp14="http://schemas.microsoft.com/office/word/2010/wordprocessingDrawing" xmlns:wp="http://schemas.openxmlformats.org/drawingml/2006/wordprocessingDrawing" xmlns:w10="urn:schemas-microsoft-com:office:word" xmlns:w="http://schemas.openxmlformats.org/wordprocessingml/2006/main" xmlns:w14="http://schemas.microsoft.com/office/word/2010/wordml" xmlns:w15="http://schemas.microsoft.com/office/word/2012/wordml" xmlns:w16cex="http://schemas.microsoft.com/office/word/2018/wordml/cex" xmlns:w16cid="http://schemas.microsoft.com/office/word/2016/wordml/cid" xmlns:w16="http://schemas.microsoft.com/office/word/2018/wordml" xmlns:w16du="http://schemas.microsoft.com/office/word/2023/wordml/word16du" xmlns:w16sdtdh="http://schemas.microsoft.com/office/word/2020/wordml/sdtdatahash" xmlns:w16sdtfl="http://schemas.microsoft.com/office/word/2024/wordml/sdtformatlock" xmlns:w16se="http://schemas.microsoft.com/office/word/2015/wordml/symex" xmlns:wpg="http://schemas.microsoft.com/office/word/2010/wordprocessingGroup" xmlns:wpi="http://schemas.microsoft.com/office/word/2010/wordprocessingInk" xmlns:wne="http://schemas.microsoft.com/office/word/2006/wordml" xmlns:wps="http://schemas.microsoft.com/office/word/2010/wordprocessingShape" mc:Ignorable="w14 w15 w16se w16cid w16 w16cex w16sdtdh w16sdtfl w16du wp14">
+  <w:p>
+    <w:pPr>
+      <w:pStyle w:val="Header"/>
+    </w:pPr>
+  </w:p>
+</w:hdr>
+</file>
+
+<file path=word/header2.xml><?xml version="1.0" encoding="utf-8"?>
 <w:hdr xmlns:wpc="http://schemas.microsoft.com/office/word/2010/wordprocessingCanvas" xmlns:cx="http://schemas.microsoft.com/office/drawing/2014/chartex" xmlns:cx1="http://schemas.microsoft.com/office/drawing/2015/9/8/chartex" xmlns:cx2="http://schemas.microsoft.com/office/drawing/2015/10/21/chartex" xmlns:cx3="http://schemas.microsoft.com/office/drawing/2016/5/9/chartex" xmlns:cx4="http://schemas.microsoft.com/office/drawing/2016/5/10/chartex" xmlns:cx5="http://schemas.microsoft.com/office/drawing/2016/5/11/chartex" xmlns:cx6="http://schemas.microsoft.com/office/drawing/2016/5/12/chartex" xmlns:cx7="http://schemas.microsoft.com/office/drawing/2016/5/13/chartex" xmlns:cx8="http://schemas.microsoft.com/office/drawing/2016/5/14/chartex" xmlns:mc="http://schemas.openxmlformats.org/markup-compatibility/2006" xmlns:aink="http://schemas.microsoft.com/office/drawing/2016/ink" xmlns:am3d="http://schemas.microsoft.com/office/drawing/2017/model3d" xmlns:o="urn:schemas-microsoft-com:office:office" xmlns:oel="http://schemas.microsoft.com/office/2019/extlst" xmlns:r="http://schemas.openxmlformats.org/officeDocument/2006/relationships" xmlns:m="http://schemas.openxmlformats.org/officeDocument/2006/math" xmlns:v="urn:schemas-microsoft-com:vml" xmlns:wp14="http://schemas.microsoft.com/office/word/2010/wordprocessingDrawing" xmlns:wp="http://schemas.openxmlformats.org/drawingml/2006/wordprocessingDrawing" xmlns:w10="urn:schemas-microsoft-com:office:word" xmlns:w="http://schemas.openxmlformats.org/wordprocessingml/2006/main" xmlns:w14="http://schemas.microsoft.com/office/word/2010/wordml" xmlns:w15="http://schemas.microsoft.com/office/word/2012/wordml" xmlns:w16cex="http://schemas.microsoft.com/office/word/2018/wordml/cex" xmlns:w16cid="http://schemas.microsoft.com/office/word/2016/wordml/cid" xmlns:w16="http://schemas.microsoft.com/office/word/2018/wordml" xmlns:w16du="http://schemas.microsoft.com/office/word/2023/wordml/word16du" xmlns:w16sdtdh="http://schemas.microsoft.com/office/word/2020/wordml/sdtdatahash" xmlns:w16sdtfl="http://schemas.microsoft.com/office/word/2024/wordml/sdtformatlock" xmlns:w16se="http://schemas.microsoft.com/office/word/2015/wordml/symex" xmlns:wpg="http://schemas.microsoft.com/office/word/2010/wordprocessingGroup" xmlns:wpi="http://schemas.microsoft.com/office/word/2010/wordprocessingInk" xmlns:wne="http://schemas.microsoft.com/office/word/2006/wordml" xmlns:wps="http://schemas.microsoft.com/office/word/2010/wordprocessingShape" mc:Ignorable="w14 w15 w16se w16cid w16 w16cex w16sdtdh w16sdtfl w16du wp14">
   <w:tbl>
     <w:tblPr>
@@ -8955,7 +8839,6 @@
       <w:tblLook w:val="06A0" w:firstRow="1" w:lastRow="0" w:firstColumn="1" w:lastColumn="0" w:noHBand="1" w:noVBand="1"/>
     </w:tblPr>
     <w:tblGrid>
-      <w:gridCol w:w="3120"/>
       <w:gridCol w:w="3120"/>
       <w:gridCol w:w="3120"/>
     </w:tblGrid>
@@ -8970,40 +8853,13 @@
         <w:p>
           <w:pPr>
             <w:pStyle w:val="Header"/>
-            <w:ind w:left="-115"/>
-            <w:rPr>
-              <w:rFonts w:ascii="Times New Roman" w:hAnsi="Times New Roman" w:cs="Times New Roman"/>
-            </w:rPr>
           </w:pPr>
           <w:r>
-            <w:rPr>
-              <w:rFonts w:ascii="Times New Roman" w:hAnsi="Times New Roman" w:cs="Times New Roman"/>
-            </w:rPr>
-            <w:t>Fall</w:t>
+            <w:t xml:space="preserve">Spring </w:t>
           </w:r>
           <w:r>
-            <w:rPr>
-              <w:rFonts w:ascii="Times New Roman" w:hAnsi="Times New Roman" w:cs="Times New Roman"/>
-            </w:rPr>
-            <w:t xml:space="preserve"> 202</w:t>
+            <w:t>2026</w:t>
           </w:r>
-          <w:r>
-            <w:rPr>
-              <w:rFonts w:ascii="Times New Roman" w:hAnsi="Times New Roman" w:cs="Times New Roman"/>
-            </w:rPr>
-            <w:t>5</w:t>
-          </w:r>
-        </w:p>
-      </w:tc>
-      <w:tc>
-        <w:tcPr>
-          <w:tcW w:w="3120" w:type="dxa"/>
-        </w:tcPr>
-        <w:p>
-          <w:pPr>
-            <w:pStyle w:val="Header"/>
-            <w:jc w:val="center"/>
-          </w:pPr>
         </w:p>
       </w:tc>
       <w:tc>
@@ -9020,6 +8876,16 @@
       </w:tc>
     </w:tr>
   </w:tbl>
+  <w:p>
+    <w:pPr>
+      <w:pStyle w:val="Header"/>
+    </w:pPr>
+  </w:p>
+</w:hdr>
+</file>
+
+<file path=word/header3.xml><?xml version="1.0" encoding="utf-8"?>
+<w:hdr xmlns:wpc="http://schemas.microsoft.com/office/word/2010/wordprocessingCanvas" xmlns:cx="http://schemas.microsoft.com/office/drawing/2014/chartex" xmlns:cx1="http://schemas.microsoft.com/office/drawing/2015/9/8/chartex" xmlns:cx2="http://schemas.microsoft.com/office/drawing/2015/10/21/chartex" xmlns:cx3="http://schemas.microsoft.com/office/drawing/2016/5/9/chartex" xmlns:cx4="http://schemas.microsoft.com/office/drawing/2016/5/10/chartex" xmlns:cx5="http://schemas.microsoft.com/office/drawing/2016/5/11/chartex" xmlns:cx6="http://schemas.microsoft.com/office/drawing/2016/5/12/chartex" xmlns:cx7="http://schemas.microsoft.com/office/drawing/2016/5/13/chartex" xmlns:cx8="http://schemas.microsoft.com/office/drawing/2016/5/14/chartex" xmlns:mc="http://schemas.openxmlformats.org/markup-compatibility/2006" xmlns:aink="http://schemas.microsoft.com/office/drawing/2016/ink" xmlns:am3d="http://schemas.microsoft.com/office/drawing/2017/model3d" xmlns:o="urn:schemas-microsoft-com:office:office" xmlns:oel="http://schemas.microsoft.com/office/2019/extlst" xmlns:r="http://schemas.openxmlformats.org/officeDocument/2006/relationships" xmlns:m="http://schemas.openxmlformats.org/officeDocument/2006/math" xmlns:v="urn:schemas-microsoft-com:vml" xmlns:wp14="http://schemas.microsoft.com/office/word/2010/wordprocessingDrawing" xmlns:wp="http://schemas.openxmlformats.org/drawingml/2006/wordprocessingDrawing" xmlns:w10="urn:schemas-microsoft-com:office:word" xmlns:w="http://schemas.openxmlformats.org/wordprocessingml/2006/main" xmlns:w14="http://schemas.microsoft.com/office/word/2010/wordml" xmlns:w15="http://schemas.microsoft.com/office/word/2012/wordml" xmlns:w16cex="http://schemas.microsoft.com/office/word/2018/wordml/cex" xmlns:w16cid="http://schemas.microsoft.com/office/word/2016/wordml/cid" xmlns:w16="http://schemas.microsoft.com/office/word/2018/wordml" xmlns:w16du="http://schemas.microsoft.com/office/word/2023/wordml/word16du" xmlns:w16sdtdh="http://schemas.microsoft.com/office/word/2020/wordml/sdtdatahash" xmlns:w16sdtfl="http://schemas.microsoft.com/office/word/2024/wordml/sdtformatlock" xmlns:w16se="http://schemas.microsoft.com/office/word/2015/wordml/symex" xmlns:wpg="http://schemas.microsoft.com/office/word/2010/wordprocessingGroup" xmlns:wpi="http://schemas.microsoft.com/office/word/2010/wordprocessingInk" xmlns:wne="http://schemas.microsoft.com/office/word/2006/wordml" xmlns:wps="http://schemas.microsoft.com/office/word/2010/wordprocessingShape" mc:Ignorable="w14 w15 w16se w16cid w16 w16cex w16sdtdh w16sdtfl w16du wp14">
   <w:p>
     <w:pPr>
       <w:pStyle w:val="Header"/>

</xml_diff>